<commit_message>
docs: format analysis tables in DOCX
</commit_message>
<xml_diff>
--- a/docs/submission/Part_A_Analysis.docx
+++ b/docs/submission/Part_A_Analysis.docx
@@ -28,61 +28,147 @@
         <w:t>Singleton (§7.1.4)</w:t>
       </w:r>
     </w:p>
-    <w:p>
-      <w:pPr>
-        <w:spacing w:after="120"/>
-      </w:pPr>
-      <w:r>
-        <w:rPr>
-          <w:rFonts w:ascii="Aptos" w:hAnsi="Aptos"/>
-        </w:rPr>
-        <w:t xml:space="preserve">  |   Question   |   Answer   |   Evidence   |  </w:t>
-      </w:r>
-    </w:p>
-    <w:p>
-      <w:pPr>
-        <w:spacing w:after="120"/>
-      </w:pPr>
-      <w:r>
-        <w:rPr>
-          <w:rFonts w:ascii="Aptos" w:hAnsi="Aptos"/>
-        </w:rPr>
-        <w:t xml:space="preserve">  |  ---  |  ---  |  ---  |  </w:t>
-      </w:r>
-    </w:p>
-    <w:p>
-      <w:pPr>
-        <w:spacing w:after="120"/>
-      </w:pPr>
-      <w:r>
-        <w:rPr>
-          <w:rFonts w:ascii="Aptos" w:hAnsi="Aptos"/>
-        </w:rPr>
-        <w:t xml:space="preserve">  |   Where is the only instance controlled?   |   `DatabaseConnection` stores the single instance in a private static field. `getInstance()` creates it only when the field is empty and returns the same object afterward.   |   `01-singleton/lib/DatabaseConnection.ts:18, 33-37`   |  </w:t>
-      </w:r>
-    </w:p>
-    <w:p>
-      <w:pPr>
-        <w:spacing w:after="120"/>
-      </w:pPr>
-      <w:r>
-        <w:rPr>
-          <w:rFonts w:ascii="Aptos" w:hAnsi="Aptos"/>
-        </w:rPr>
-        <w:t xml:space="preserve">  |   What would change if the constructor were public?   |   Any caller could create another connection with `new DatabaseConnection()`, so the class could no longer guarantee one shared connection.   |   `01-singleton/lib/DatabaseConnection.ts:26` makes the constructor private.   |  </w:t>
-      </w:r>
-    </w:p>
-    <w:p>
-      <w:pPr>
-        <w:spacing w:after="120"/>
-      </w:pPr>
-      <w:r>
-        <w:rPr>
-          <w:rFonts w:ascii="Aptos" w:hAnsi="Aptos"/>
-        </w:rPr>
-        <w:t xml:space="preserve">  |   Where could I use this in my own project?   |   A single client for a browser cache, analytics queue, or configuration registry is a reasonable use when all callers must share one resource. In StudyFlow I used a Repository abstraction instead because the storage dependency should remain replaceable and testable.   |   `04-studyflow/repositories/TaskRepository.ts:16-56`   |  </w:t>
-      </w:r>
-    </w:p>
+    <w:tbl>
+      <w:tblPr>
+        <w:tblStyle w:val="TableGrid"/>
+        <w:tblW w:type="auto" w:w="0"/>
+        <w:tblLook w:firstColumn="1" w:firstRow="1" w:lastColumn="0" w:lastRow="0" w:noHBand="0" w:noVBand="1" w:val="04A0"/>
+      </w:tblPr>
+      <w:tblGrid>
+        <w:gridCol w:w="3312"/>
+        <w:gridCol w:w="3312"/>
+        <w:gridCol w:w="3312"/>
+      </w:tblGrid>
+      <w:tr>
+        <w:tc>
+          <w:tcPr>
+            <w:tcW w:type="dxa" w:w="3312"/>
+          </w:tcPr>
+          <w:p>
+            <w:r>
+              <w:t>Question</w:t>
+            </w:r>
+          </w:p>
+        </w:tc>
+        <w:tc>
+          <w:tcPr>
+            <w:tcW w:type="dxa" w:w="3312"/>
+          </w:tcPr>
+          <w:p>
+            <w:r>
+              <w:t>Answer</w:t>
+            </w:r>
+          </w:p>
+        </w:tc>
+        <w:tc>
+          <w:tcPr>
+            <w:tcW w:type="dxa" w:w="3312"/>
+          </w:tcPr>
+          <w:p>
+            <w:r>
+              <w:t>Evidence</w:t>
+            </w:r>
+          </w:p>
+        </w:tc>
+      </w:tr>
+      <w:tr>
+        <w:tc>
+          <w:tcPr>
+            <w:tcW w:type="dxa" w:w="3312"/>
+          </w:tcPr>
+          <w:p>
+            <w:r>
+              <w:t>Where is the only instance controlled?</w:t>
+            </w:r>
+          </w:p>
+        </w:tc>
+        <w:tc>
+          <w:tcPr>
+            <w:tcW w:type="dxa" w:w="3312"/>
+          </w:tcPr>
+          <w:p>
+            <w:r>
+              <w:t>`DatabaseConnection` stores the single instance in a private static field. `getInstance()` creates it only when the field is empty and returns the same object afterward.</w:t>
+            </w:r>
+          </w:p>
+        </w:tc>
+        <w:tc>
+          <w:tcPr>
+            <w:tcW w:type="dxa" w:w="3312"/>
+          </w:tcPr>
+          <w:p>
+            <w:r>
+              <w:t>`01-singleton/lib/DatabaseConnection.ts:18, 33-37`</w:t>
+            </w:r>
+          </w:p>
+        </w:tc>
+      </w:tr>
+      <w:tr>
+        <w:tc>
+          <w:tcPr>
+            <w:tcW w:type="dxa" w:w="3312"/>
+          </w:tcPr>
+          <w:p>
+            <w:r>
+              <w:t>What would change if the constructor were public?</w:t>
+            </w:r>
+          </w:p>
+        </w:tc>
+        <w:tc>
+          <w:tcPr>
+            <w:tcW w:type="dxa" w:w="3312"/>
+          </w:tcPr>
+          <w:p>
+            <w:r>
+              <w:t>Any caller could create another connection with `new DatabaseConnection()`, so the class could no longer guarantee one shared connection.</w:t>
+            </w:r>
+          </w:p>
+        </w:tc>
+        <w:tc>
+          <w:tcPr>
+            <w:tcW w:type="dxa" w:w="3312"/>
+          </w:tcPr>
+          <w:p>
+            <w:r>
+              <w:t>`01-singleton/lib/DatabaseConnection.ts:26` makes the constructor private.</w:t>
+            </w:r>
+          </w:p>
+        </w:tc>
+      </w:tr>
+      <w:tr>
+        <w:tc>
+          <w:tcPr>
+            <w:tcW w:type="dxa" w:w="3312"/>
+          </w:tcPr>
+          <w:p>
+            <w:r>
+              <w:t>Where could I use this in my own project?</w:t>
+            </w:r>
+          </w:p>
+        </w:tc>
+        <w:tc>
+          <w:tcPr>
+            <w:tcW w:type="dxa" w:w="3312"/>
+          </w:tcPr>
+          <w:p>
+            <w:r>
+              <w:t>A single client for a browser cache, analytics queue, or configuration registry is a reasonable use when all callers must share one resource. In StudyFlow I used a Repository abstraction instead because the storage dependency should remain replaceable and testable.</w:t>
+            </w:r>
+          </w:p>
+        </w:tc>
+        <w:tc>
+          <w:tcPr>
+            <w:tcW w:type="dxa" w:w="3312"/>
+          </w:tcPr>
+          <w:p>
+            <w:r>
+              <w:t>`04-studyflow/repositories/TaskRepository.ts:16-56`</w:t>
+            </w:r>
+          </w:p>
+        </w:tc>
+      </w:tr>
+    </w:tbl>
+    <w:p/>
     <w:p>
       <w:pPr>
         <w:pStyle w:val="Heading2"/>
@@ -92,61 +178,147 @@
         <w:t>Factory (§7.2.4)</w:t>
       </w:r>
     </w:p>
-    <w:p>
-      <w:pPr>
-        <w:spacing w:after="120"/>
-      </w:pPr>
-      <w:r>
-        <w:rPr>
-          <w:rFonts w:ascii="Aptos" w:hAnsi="Aptos"/>
-        </w:rPr>
-        <w:t xml:space="preserve">  |   Question   |   Answer   |   Evidence   |  </w:t>
-      </w:r>
-    </w:p>
-    <w:p>
-      <w:pPr>
-        <w:spacing w:after="120"/>
-      </w:pPr>
-      <w:r>
-        <w:rPr>
-          <w:rFonts w:ascii="Aptos" w:hAnsi="Aptos"/>
-        </w:rPr>
-        <w:t xml:space="preserve">  |  ---  |  ---  |  ---  |  </w:t>
-      </w:r>
-    </w:p>
-    <w:p>
-      <w:pPr>
-        <w:spacing w:after="120"/>
-      </w:pPr>
-      <w:r>
-        <w:rPr>
-          <w:rFonts w:ascii="Aptos" w:hAnsi="Aptos"/>
-        </w:rPr>
-        <w:t xml:space="preserve">  |   Where is the concrete class selected?   |   The `NotifierFactory.create()` switch selects Email, SMS, Push, or Wasap based on the requested channel. The caller asks for a notifier without constructing a concrete class.   |   `02-factory/lib/notifications.ts:65-80`; caller `02-factory/app/api/factory/route.ts:14`   |  </w:t>
-      </w:r>
-    </w:p>
-    <w:p>
-      <w:pPr>
-        <w:spacing w:after="120"/>
-      </w:pPr>
-      <w:r>
-        <w:rPr>
-          <w:rFonts w:ascii="Aptos" w:hAnsi="Aptos"/>
-        </w:rPr>
-        <w:t xml:space="preserve">  |   What would I change to add WhatsApp?   |   Add a WhatsApp product implementing `Notifier`, add a `guasap`/WhatsApp case to the factory switch, and add a route or request value that selects it. The instructor prototype already demonstrates this extension.   |   `02-factory/lib/notifications.ts:51-62, 68-75`   |  </w:t>
-      </w:r>
-    </w:p>
-    <w:p>
-      <w:pPr>
-        <w:spacing w:after="120"/>
-      </w:pPr>
-      <w:r>
-        <w:rPr>
-          <w:rFonts w:ascii="Aptos" w:hAnsi="Aptos"/>
-        </w:rPr>
-        <w:t xml:space="preserve">  |   Where could I use this in my own project?   |   A notification service, payment provider, export format, or task type can hide variant construction behind one stable API. StudyFlow uses the same idea for Assignment, Exam, and Project products.   |   `04-studyflow/patterns/factory/TaskFactory.ts:56-75`   |  </w:t>
-      </w:r>
-    </w:p>
+    <w:tbl>
+      <w:tblPr>
+        <w:tblStyle w:val="TableGrid"/>
+        <w:tblW w:type="auto" w:w="0"/>
+        <w:tblLook w:firstColumn="1" w:firstRow="1" w:lastColumn="0" w:lastRow="0" w:noHBand="0" w:noVBand="1" w:val="04A0"/>
+      </w:tblPr>
+      <w:tblGrid>
+        <w:gridCol w:w="3312"/>
+        <w:gridCol w:w="3312"/>
+        <w:gridCol w:w="3312"/>
+      </w:tblGrid>
+      <w:tr>
+        <w:tc>
+          <w:tcPr>
+            <w:tcW w:type="dxa" w:w="3312"/>
+          </w:tcPr>
+          <w:p>
+            <w:r>
+              <w:t>Question</w:t>
+            </w:r>
+          </w:p>
+        </w:tc>
+        <w:tc>
+          <w:tcPr>
+            <w:tcW w:type="dxa" w:w="3312"/>
+          </w:tcPr>
+          <w:p>
+            <w:r>
+              <w:t>Answer</w:t>
+            </w:r>
+          </w:p>
+        </w:tc>
+        <w:tc>
+          <w:tcPr>
+            <w:tcW w:type="dxa" w:w="3312"/>
+          </w:tcPr>
+          <w:p>
+            <w:r>
+              <w:t>Evidence</w:t>
+            </w:r>
+          </w:p>
+        </w:tc>
+      </w:tr>
+      <w:tr>
+        <w:tc>
+          <w:tcPr>
+            <w:tcW w:type="dxa" w:w="3312"/>
+          </w:tcPr>
+          <w:p>
+            <w:r>
+              <w:t>Where is the concrete class selected?</w:t>
+            </w:r>
+          </w:p>
+        </w:tc>
+        <w:tc>
+          <w:tcPr>
+            <w:tcW w:type="dxa" w:w="3312"/>
+          </w:tcPr>
+          <w:p>
+            <w:r>
+              <w:t>The `NotifierFactory.create()` switch selects Email, SMS, Push, or Wasap based on the requested channel. The caller asks for a notifier without constructing a concrete class.</w:t>
+            </w:r>
+          </w:p>
+        </w:tc>
+        <w:tc>
+          <w:tcPr>
+            <w:tcW w:type="dxa" w:w="3312"/>
+          </w:tcPr>
+          <w:p>
+            <w:r>
+              <w:t>`02-factory/lib/notifications.ts:65-80`; caller `02-factory/app/api/factory/route.ts:14`</w:t>
+            </w:r>
+          </w:p>
+        </w:tc>
+      </w:tr>
+      <w:tr>
+        <w:tc>
+          <w:tcPr>
+            <w:tcW w:type="dxa" w:w="3312"/>
+          </w:tcPr>
+          <w:p>
+            <w:r>
+              <w:t>What would I change to add WhatsApp?</w:t>
+            </w:r>
+          </w:p>
+        </w:tc>
+        <w:tc>
+          <w:tcPr>
+            <w:tcW w:type="dxa" w:w="3312"/>
+          </w:tcPr>
+          <w:p>
+            <w:r>
+              <w:t>Add a WhatsApp product implementing `Notifier`, add a `guasap`/WhatsApp case to the factory switch, and add a route or request value that selects it. The instructor prototype already demonstrates this extension.</w:t>
+            </w:r>
+          </w:p>
+        </w:tc>
+        <w:tc>
+          <w:tcPr>
+            <w:tcW w:type="dxa" w:w="3312"/>
+          </w:tcPr>
+          <w:p>
+            <w:r>
+              <w:t>`02-factory/lib/notifications.ts:51-62, 68-75`</w:t>
+            </w:r>
+          </w:p>
+        </w:tc>
+      </w:tr>
+      <w:tr>
+        <w:tc>
+          <w:tcPr>
+            <w:tcW w:type="dxa" w:w="3312"/>
+          </w:tcPr>
+          <w:p>
+            <w:r>
+              <w:t>Where could I use this in my own project?</w:t>
+            </w:r>
+          </w:p>
+        </w:tc>
+        <w:tc>
+          <w:tcPr>
+            <w:tcW w:type="dxa" w:w="3312"/>
+          </w:tcPr>
+          <w:p>
+            <w:r>
+              <w:t>A notification service, payment provider, export format, or task type can hide variant construction behind one stable API. StudyFlow uses the same idea for Assignment, Exam, and Project products.</w:t>
+            </w:r>
+          </w:p>
+        </w:tc>
+        <w:tc>
+          <w:tcPr>
+            <w:tcW w:type="dxa" w:w="3312"/>
+          </w:tcPr>
+          <w:p>
+            <w:r>
+              <w:t>`04-studyflow/patterns/factory/TaskFactory.ts:56-75`</w:t>
+            </w:r>
+          </w:p>
+        </w:tc>
+      </w:tr>
+    </w:tbl>
+    <w:p/>
     <w:p>
       <w:pPr>
         <w:pStyle w:val="Heading2"/>
@@ -156,61 +328,147 @@
         <w:t>MVC (§7.3.4)</w:t>
       </w:r>
     </w:p>
-    <w:p>
-      <w:pPr>
-        <w:spacing w:after="120"/>
-      </w:pPr>
-      <w:r>
-        <w:rPr>
-          <w:rFonts w:ascii="Aptos" w:hAnsi="Aptos"/>
-        </w:rPr>
-        <w:t xml:space="preserve">  |   Question   |   Answer   |   Evidence   |  </w:t>
-      </w:r>
-    </w:p>
-    <w:p>
-      <w:pPr>
-        <w:spacing w:after="120"/>
-      </w:pPr>
-      <w:r>
-        <w:rPr>
-          <w:rFonts w:ascii="Aptos" w:hAnsi="Aptos"/>
-        </w:rPr>
-        <w:t xml:space="preserve">  |  ---  |  ---  |  ---  |  </w:t>
-      </w:r>
-    </w:p>
-    <w:p>
-      <w:pPr>
-        <w:spacing w:after="120"/>
-      </w:pPr>
-      <w:r>
-        <w:rPr>
-          <w:rFonts w:ascii="Aptos" w:hAnsi="Aptos"/>
-        </w:rPr>
-        <w:t xml:space="preserve">  |   Which files are Model, View, and Controller?   |   Model: `models/Task.ts`; View: `components/TaskForm.tsx` and `components/TaskList.tsx`; Controller: `controllers/TaskController.ts`. API routes connect HTTP requests to the controller.   |   `03-mvc/models/Task.ts:12-38`; `03-mvc/components/TaskForm.tsx`; `03-mvc/components/TaskList.tsx`; `03-mvc/controllers/TaskController.ts:15-58`   |  </w:t>
-      </w:r>
-    </w:p>
-    <w:p>
-      <w:pPr>
-        <w:spacing w:after="120"/>
-      </w:pPr>
-      <w:r>
-        <w:rPr>
-          <w:rFonts w:ascii="Aptos" w:hAnsi="Aptos"/>
-        </w:rPr>
-        <w:t xml:space="preserve">  |   What happens if the View calls `fetch` directly?   |   Rendering becomes coupled to transport details, validation and error handling get duplicated, and the View becomes harder to test or reuse. The controller boundary keeps those concerns in one place.   |   `03-mvc/app/api/tasks/route.ts:5-16` delegates to the controller instead of putting task rules in the component.   |  </w:t>
-      </w:r>
-    </w:p>
-    <w:p>
-      <w:pPr>
-        <w:spacing w:after="120"/>
-      </w:pPr>
-      <w:r>
-        <w:rPr>
-          <w:rFonts w:ascii="Aptos" w:hAnsi="Aptos"/>
-        </w:rPr>
-        <w:t xml:space="preserve">  |   Where could I use MVC in my own project?   |   A dashboard or CRUD application benefits from a View for rendering, a Controller for use-case coordination, and a Model for domain rules. StudyFlow applies this as a React View, `useTaskController`, and immutable task model.   |   `04-studyflow/app/page.tsx:15-21`; `04-studyflow/controllers/useTaskController.ts:24-83`; `04-studyflow/domain/TaskModel.ts:10-41`   |  </w:t>
-      </w:r>
-    </w:p>
+    <w:tbl>
+      <w:tblPr>
+        <w:tblStyle w:val="TableGrid"/>
+        <w:tblW w:type="auto" w:w="0"/>
+        <w:tblLook w:firstColumn="1" w:firstRow="1" w:lastColumn="0" w:lastRow="0" w:noHBand="0" w:noVBand="1" w:val="04A0"/>
+      </w:tblPr>
+      <w:tblGrid>
+        <w:gridCol w:w="3312"/>
+        <w:gridCol w:w="3312"/>
+        <w:gridCol w:w="3312"/>
+      </w:tblGrid>
+      <w:tr>
+        <w:tc>
+          <w:tcPr>
+            <w:tcW w:type="dxa" w:w="3312"/>
+          </w:tcPr>
+          <w:p>
+            <w:r>
+              <w:t>Question</w:t>
+            </w:r>
+          </w:p>
+        </w:tc>
+        <w:tc>
+          <w:tcPr>
+            <w:tcW w:type="dxa" w:w="3312"/>
+          </w:tcPr>
+          <w:p>
+            <w:r>
+              <w:t>Answer</w:t>
+            </w:r>
+          </w:p>
+        </w:tc>
+        <w:tc>
+          <w:tcPr>
+            <w:tcW w:type="dxa" w:w="3312"/>
+          </w:tcPr>
+          <w:p>
+            <w:r>
+              <w:t>Evidence</w:t>
+            </w:r>
+          </w:p>
+        </w:tc>
+      </w:tr>
+      <w:tr>
+        <w:tc>
+          <w:tcPr>
+            <w:tcW w:type="dxa" w:w="3312"/>
+          </w:tcPr>
+          <w:p>
+            <w:r>
+              <w:t>Which files are Model, View, and Controller?</w:t>
+            </w:r>
+          </w:p>
+        </w:tc>
+        <w:tc>
+          <w:tcPr>
+            <w:tcW w:type="dxa" w:w="3312"/>
+          </w:tcPr>
+          <w:p>
+            <w:r>
+              <w:t>Model: `models/Task.ts`; View: `components/TaskForm.tsx` and `components/TaskList.tsx`; Controller: `controllers/TaskController.ts`. API routes connect HTTP requests to the controller.</w:t>
+            </w:r>
+          </w:p>
+        </w:tc>
+        <w:tc>
+          <w:tcPr>
+            <w:tcW w:type="dxa" w:w="3312"/>
+          </w:tcPr>
+          <w:p>
+            <w:r>
+              <w:t>`03-mvc/models/Task.ts:12-38`; `03-mvc/components/TaskForm.tsx`; `03-mvc/components/TaskList.tsx`; `03-mvc/controllers/TaskController.ts:15-58`</w:t>
+            </w:r>
+          </w:p>
+        </w:tc>
+      </w:tr>
+      <w:tr>
+        <w:tc>
+          <w:tcPr>
+            <w:tcW w:type="dxa" w:w="3312"/>
+          </w:tcPr>
+          <w:p>
+            <w:r>
+              <w:t>What happens if the View calls `fetch` directly?</w:t>
+            </w:r>
+          </w:p>
+        </w:tc>
+        <w:tc>
+          <w:tcPr>
+            <w:tcW w:type="dxa" w:w="3312"/>
+          </w:tcPr>
+          <w:p>
+            <w:r>
+              <w:t>Rendering becomes coupled to transport details, validation and error handling get duplicated, and the View becomes harder to test or reuse. The controller boundary keeps those concerns in one place.</w:t>
+            </w:r>
+          </w:p>
+        </w:tc>
+        <w:tc>
+          <w:tcPr>
+            <w:tcW w:type="dxa" w:w="3312"/>
+          </w:tcPr>
+          <w:p>
+            <w:r>
+              <w:t>`03-mvc/app/api/tasks/route.ts:5-16` delegates to the controller instead of putting task rules in the component.</w:t>
+            </w:r>
+          </w:p>
+        </w:tc>
+      </w:tr>
+      <w:tr>
+        <w:tc>
+          <w:tcPr>
+            <w:tcW w:type="dxa" w:w="3312"/>
+          </w:tcPr>
+          <w:p>
+            <w:r>
+              <w:t>Where could I use MVC in my own project?</w:t>
+            </w:r>
+          </w:p>
+        </w:tc>
+        <w:tc>
+          <w:tcPr>
+            <w:tcW w:type="dxa" w:w="3312"/>
+          </w:tcPr>
+          <w:p>
+            <w:r>
+              <w:t>A dashboard or CRUD application benefits from a View for rendering, a Controller for use-case coordination, and a Model for domain rules. StudyFlow applies this as a React View, `useTaskController`, and immutable task model.</w:t>
+            </w:r>
+          </w:p>
+        </w:tc>
+        <w:tc>
+          <w:tcPr>
+            <w:tcW w:type="dxa" w:w="3312"/>
+          </w:tcPr>
+          <w:p>
+            <w:r>
+              <w:t>`04-studyflow/app/page.tsx:15-21`; `04-studyflow/controllers/useTaskController.ts:24-83`; `04-studyflow/domain/TaskModel.ts:10-41`</w:t>
+            </w:r>
+          </w:p>
+        </w:tc>
+      </w:tr>
+    </w:tbl>
+    <w:p/>
     <w:p>
       <w:pPr>
         <w:pStyle w:val="Heading2"/>

</xml_diff>

<commit_message>
fix: sort tasks by selected priority strategy
</commit_message>
<xml_diff>
--- a/docs/submission/Part_A_Analysis.docx
+++ b/docs/submission/Part_A_Analysis.docx
@@ -312,7 +312,7 @@
           </w:tcPr>
           <w:p>
             <w:r>
-              <w:t>`04-studyflow/patterns/factory/TaskFactory.ts:56-75`</w:t>
+              <w:t>`04-studyflow/patterns/factory/TaskFactory.ts:32-60`</w:t>
             </w:r>
           </w:p>
         </w:tc>
@@ -398,7 +398,7 @@
           </w:tcPr>
           <w:p>
             <w:r>
-              <w:t>`03-mvc/models/Task.ts:12-38`; `03-mvc/components/TaskForm.tsx`; `03-mvc/components/TaskList.tsx`; `03-mvc/controllers/TaskController.ts:15-58`</w:t>
+              <w:t>`03-mvc/models/Task.ts:12-38`; `03-mvc/components/TaskForm.tsx`; `03-mvc/components/TaskList.tsx`; `03-mvc/controllers/TaskController.ts:15-44`</w:t>
             </w:r>
           </w:p>
         </w:tc>

</xml_diff>